<commit_message>
Update gitbook 2026-06-01 16:04:38
</commit_message>
<xml_diff>
--- a/FirstWeekChecklist.docx
+++ b/FirstWeekChecklist.docx
@@ -17,7 +17,7 @@
           <w:sz w:val="48"/>
           <w:szCs w:val="48"/>
         </w:rPr>
-        <w:t>peeke</w:t>
+        <w:t>hs</w:t>
       </w:r>
       <w:r>
         <w:rPr>
@@ -495,6 +495,29 @@
           <w:szCs w:val="28"/>
         </w:rPr>
         <w:t>Successfully submit one Pull Request</w:t>
+      </w:r>
+    </w:p>
+    <w:p>
+      <w:pPr>
+        <w:pStyle w:val="ListParagraph"/>
+        <w:numPr>
+          <w:ilvl w:val="0"/>
+          <w:numId w:val="1"/>
+        </w:numPr>
+        <w:spacing w:line="640" w:lineRule="exact"/>
+        <w:rPr>
+          <w:rFonts w:ascii="Inter" w:hAnsi="Inter"/>
+          <w:sz w:val="28"/>
+          <w:szCs w:val="28"/>
+        </w:rPr>
+      </w:pPr>
+      <w:r>
+        <w:rPr>
+          <w:rFonts w:ascii="Inter" w:hAnsi="Inter"/>
+          <w:sz w:val="28"/>
+          <w:szCs w:val="28"/>
+        </w:rPr>
+        <w:t>Break HyTOP in some way (find a bug)</w:t>
       </w:r>
     </w:p>
     <w:sectPr>

</xml_diff>